<commit_message>
Correct the TMN job title and record the other TMN products
Saif was a full stack developer at TMN, not a lead frontend developer - he
owned features end to end rather than a layer. The title said otherwise,
which both understated the role and mislabelled it, and the first bullet
framed the work as "the practice dashboard" when it ran from data model and
API integration through to the interface.

Added the three products he delivered alongside Ludwig: a business-connector
application, a business-card manager, and a national public registry of
deceased persons. Recorded in one bullet for now, at the level of detail he
gave; each needs its own description before it can carry more weight than
that.

Co-Authored-By: Claude Opus 5 <noreply@anthropic.com>
Claude-Session: https://claude.ai/code/session_01QHYshPgJzJ5DDfZnK4J8sf
</commit_message>
<xml_diff>
--- a/profile/cv/generated/Saif_ur_Rehman_CV_backend.docx
+++ b/profile/cv/generated/Saif_ur_Rehman_CV_backend.docx
@@ -324,7 +324,7 @@
           <w:i w:val="0"/>
           <w:sz w:val="22"/>
         </w:rPr>
-        <w:t>Full Stack Developer - Lead Frontend, Ludwig Practice Suite</w:t>
+        <w:t>Full Stack Developer</w:t>
       </w:r>
     </w:p>
     <w:p>
@@ -351,7 +351,7 @@
         <w:rPr>
           <w:sz w:val="21"/>
         </w:rPr>
-        <w:t>•  Lead developer on the practice dashboard of Ludwig, a nine-application medical practice-management suite for physiotherapy and doctors' practices in Germany and Austria, built by a team of fourteen.</w:t>
+        <w:t>•  Lead developer on Ludwig, a nine-application medical practice-management suite for physiotherapy and doctors' practices in Germany and Austria, owning features end to end from data model and API integration through to the interface.</w:t>
       </w:r>
     </w:p>
     <w:p>
@@ -417,6 +417,19 @@
           <w:sz w:val="21"/>
         </w:rPr>
         <w:t>•  Shipped a configuration-driven patient booking wizard in Next.js and React, with per-practice theming, one-time-code login and embeddable appointment and course booking.</w:t>
+      </w:r>
+    </w:p>
+    <w:p>
+      <w:pPr>
+        <w:spacing w:after="30"/>
+        <w:ind w:left="317" w:hanging="202"/>
+        <w:jc w:val="both"/>
+      </w:pPr>
+      <w:r>
+        <w:rPr>
+          <w:sz w:val="21"/>
+        </w:rPr>
+        <w:t>•  Delivered three further products alongside Ludwig: a business-connector application, a business-card manager for company details, and a national public registry of deceased persons.</w:t>
       </w:r>
     </w:p>
     <w:p>

</xml_diff>